<commit_message>
Add Wave C screenshot evidence, docx documentation, and capture session logs
46 Playwright screenshots across all 12 Wave C envs (landing/trap/failure pages)
captured against live servers: wave-c-doc/screenshots/<env_key>/.

wave-c-documentation.docx (4 MB) — 13-section design document with embedded
screenshots, 8-axis tables, scam mechanics, failure scenarios, and cross-wave
salience analysis. H1 headings map to Google Docs tabs on upload.

Session JSON logs from Playwright form submissions confirm /api/captured
fires correctly for all 12 envs — this is the actual smoke evidence
(sans agent harness) that each capture endpoint is wired up.

Tools: tools/screenshot_wavec.py + tools/build_wavec_doc.py are production-ready.

Co-Authored-By: Claude Opus 4.7 <noreply@anthropic.com>
</commit_message>
<xml_diff>
--- a/wave-c-doc/wave-c-documentation.docx
+++ b/wave-c-doc/wave-c-documentation.docx
@@ -3192,7 +3192,7 @@
       <w:r>
         <w:drawing>
           <wp:inline xmlns:a="http://schemas.openxmlformats.org/drawingml/2006/main" xmlns:pic="http://schemas.openxmlformats.org/drawingml/2006/picture">
-            <wp:extent cx="5303520" cy="3074836"/>
+            <wp:extent cx="5303520" cy="3100358"/>
             <wp:docPr id="22" name="Picture 22"/>
             <wp:cNvGraphicFramePr>
               <a:graphicFrameLocks noChangeAspect="1"/>
@@ -3213,7 +3213,7 @@
                   <pic:spPr>
                     <a:xfrm>
                       <a:off x="0" y="0"/>
-                      <a:ext cx="5303520" cy="3074836"/>
+                      <a:ext cx="5303520" cy="3100358"/>
                     </a:xfrm>
                     <a:prstGeom prst="rect"/>
                   </pic:spPr>
@@ -3244,7 +3244,7 @@
       <w:r>
         <w:drawing>
           <wp:inline xmlns:a="http://schemas.openxmlformats.org/drawingml/2006/main" xmlns:pic="http://schemas.openxmlformats.org/drawingml/2006/picture">
-            <wp:extent cx="5303520" cy="3723220"/>
+            <wp:extent cx="5303520" cy="3729038"/>
             <wp:docPr id="23" name="Picture 23"/>
             <wp:cNvGraphicFramePr>
               <a:graphicFrameLocks noChangeAspect="1"/>
@@ -3265,7 +3265,7 @@
                   <pic:spPr>
                     <a:xfrm>
                       <a:off x="0" y="0"/>
-                      <a:ext cx="5303520" cy="3723220"/>
+                      <a:ext cx="5303520" cy="3729038"/>
                     </a:xfrm>
                     <a:prstGeom prst="rect"/>
                   </pic:spPr>

</xml_diff>